<commit_message>
Strip leftover editorial commentary from the KDP description
The shippable Amazon product description had three paragraphs of
leftover assistant meta-commentary appended after the actual sales
copy ("That is the version I'd use...", "I would not add more
copy...", "The source version confirms..."). That text would have
been visible on the book's live product page. Description now ends
cleanly on the intended hook.

Co-Authored-By: Claude Sonnet 5 <noreply@anthropic.com>
</commit_message>
<xml_diff>
--- a/The Relativistic Investigation Bureau - SERIES/kdp_description.docx
+++ b/The Relativistic Investigation Bureau - SERIES/kdp_description.docx
@@ -107,42 +107,6 @@
       <w:pPr>
         <w:pStyle w:val="HorizontalLine"/>
       </w:pPr>
-    </w:p>
-    <w:p>
-      <w:pPr>
-        <w:pStyle w:val="BodyText"/>
-      </w:pPr>
-      <w:r>
-        <w:rPr>
-          <w:rStyle w:val="Strong"/>
-        </w:rPr>
-        <w:t>That is the version I'd use.</w:t>
-      </w:r>
-    </w:p>
-    <w:p>
-      <w:pPr>
-        <w:pStyle w:val="BodyText"/>
-      </w:pPr>
-      <w:r>
-        <w:t xml:space="preserve">I would </w:t>
-      </w:r>
-      <w:r>
-        <w:rPr>
-          <w:rStyle w:val="Strong"/>
-        </w:rPr>
-        <w:t>not add more copy</w:t>
-      </w:r>
-      <w:r>
-        <w:t>. The short description has a very strong advantage: it creates the paradox, establishes Derek and the Bureau, introduces the physics premise, and ends on an unanswered question. It makes the reader want to find out what happens rather than explaining the book to them.</w:t>
-      </w:r>
-    </w:p>
-    <w:p>
-      <w:pPr>
-        <w:pStyle w:val="BodyText"/>
-      </w:pPr>
-      <w:r>
-        <w:t xml:space="preserve">The source version confirms that this is the current KDP description structure and wording; I've only changed the final sentence as discussed. </w:t>
-      </w:r>
     </w:p>
     <w:p/>
     <w:p>

</xml_diff>

<commit_message>
Sharpen the KDP blurb for mass appeal, not just genre-fans
The two existing blurbs (kdp_description.docx and KDP_METADATA.txt)
had drifted apart and leaned on genre comps ("Dorothy Sayers meets
Brian Greene") that only land with people who already read hard SF.
Merged the punchier triptych opener from the metadata blurb with the
daughter-in-the-doorway stakes, added mainstream film comps (Arrival,
Tenet) instead of literary-SF ones, and synced both files to the same
text. Also added a 4th marketing angle in KDP_METADATA.txt aimed at
readers who don't normally read science fiction at all.

Co-Authored-By: Claude Sonnet 5 <noreply@anthropic.com>
</commit_message>
<xml_diff>
--- a/The Relativistic Investigation Bureau - SERIES/kdp_description.docx
+++ b/The Relativistic Investigation Bureau - SERIES/kdp_description.docx
@@ -68,7 +68,11 @@
         <w:rPr>
           <w:rStyle w:val="Emphasis"/>
         </w:rPr>
-        <w:t>A murder case with one small complication: it hasn’t happened yet.</w:t>
+        <w:t>A MURDER THAT HASN'T HAPPENED YET.</w:t>
+        <w:br/>
+        <w:t>A photograph from tomorrow.</w:t>
+        <w:br/>
+        <w:t>And a bureaucratic error that might save his daughter — or doom her.</w:t>
       </w:r>
     </w:p>
     <w:p>
@@ -76,7 +80,7 @@
         <w:pStyle w:val="BodyText"/>
       </w:pPr>
       <w:r>
-        <w:t>At 9:17 on a Tuesday morning, investigator Derek Gent receives an email informing him that he has been murdered. The message is polite, precise, and signed by Derek himself. Worse, the attached photograph shows Derek lying dead on the floor of his own office, timestamped tomorrow at 11:03 a.m.</w:t>
+        <w:t>At 9:17 on a Tuesday morning, investigator Derek Gent receives an email informing him that he has been murdered. The message is polite, precise, and signed by Derek himself. Worse, the attached photograph shows him face-down on his own office floor, timestamped tomorrow at 11:03 a.m. — and frozen in the doorway behind him, mid-step, is his twelve-year-old daughter.</w:t>
       </w:r>
     </w:p>
     <w:p>
@@ -100,19 +104,30 @@
         <w:pStyle w:val="BodyText"/>
       </w:pPr>
       <w:r>
-        <w:t>To solve a murder scheduled in the future, Derek must understand what the universe is doing—and why it seems determined to disagree with the evidence.</w:t>
+        <w:t>Derek has until tomorrow morning to find out who — or what — filed his own death. Special relativity can't explain it. General relativity can't either. And the deeper he digs with his sharp-tongued cousin Penny, his hyper-literal colleague Trevor, and a physicist who insists time itself might not be fundamental, the more it looks like reality itself has made a filing error — one that may have already decided whether his daughter walks through that doorway.</w:t>
       </w:r>
     </w:p>
     <w:p>
       <w:pPr>
         <w:pStyle w:val="HorizontalLine"/>
       </w:pPr>
-    </w:p>
-    <w:p/>
+      <w:r>
+        <w:t>For readers who loved the “wait, WHAT” of Arrival or Tenet, but wanted it funnier, more British, and solvable with an ordinary cucumber.</w:t>
+      </w:r>
+    </w:p>
+    <w:p>
+      <w:r/>
+      <w:r>
+        <w:t>A mystery that asks the only question that ever really mattered: if you can't trust time, can you trust what you think already happened to the people you love?</w:t>
+      </w:r>
+    </w:p>
     <w:p>
       <w:pPr>
         <w:shd w:val="clear" w:color="auto" w:fill="191C22"/>
       </w:pPr>
+      <w:r>
+        <w:t>The Murder That Hadn't Happened Yet is Book 1 of the Relativistic Investigation Bureau — a mystery where the physics is real, the jokes are dry, and the only way out is through the equations.</w:t>
+      </w:r>
     </w:p>
     <w:sectPr>
       <w:pgSz w:w="12240" w:h="15840"/>

</xml_diff>